<commit_message>
update tnc and privacy policy files
</commit_message>
<xml_diff>
--- a/public/docs/tnc.docx
+++ b/public/docs/tnc.docx
@@ -60,8 +60,35 @@
           <w:szCs w:val="24"/>
           <w:rtl w:val="0"/>
         </w:rPr>
-        <w:t xml:space="preserve"> December 13, 2025</w:t>
+        <w:t xml:space="preserve"> </w:t>
+      </w:r>
+      <w:r>
+        <w:rPr>
+          <w:color w:val="0f1115"/>
+          <w:sz w:val="24"/>
+          <w:szCs w:val="24"/>
+          <w:rtl w:val="0"/>
+        </w:rPr>
+        <w:t xml:space="preserve">March 8, 2026</w:t>
+      </w:r>
+      <w:r>
+        <w:rPr>
+          <w:b w:val="1"/>
+          <w:bCs w:val="1"/>
+          <w:color w:val="0f1115"/>
+          <w:sz w:val="24"/>
+          <w:szCs w:val="24"/>
+          <w:rtl w:val="0"/>
+        </w:rPr>
         <w:br w:type="textWrapping"/>
+      </w:r>
+      <w:r>
+        <w:rPr>
+          <w:color w:val="0f1115"/>
+          <w:sz w:val="24"/>
+          <w:szCs w:val="24"/>
+          <w:rtl w:val="0"/>
+        </w:rPr>
         <w:t xml:space="preserve"> </w:t>
       </w:r>
       <w:r>
@@ -82,7 +109,7 @@
           <w:szCs w:val="24"/>
           <w:rtl w:val="0"/>
         </w:rPr>
-        <w:t xml:space="preserve"> support@bettim.com</w:t>
+        <w:t xml:space="preserve"> support@bettim.co</w:t>
       </w:r>
     </w:p>
     <w:p>
@@ -632,7 +659,7 @@
           <w:szCs w:val="24"/>
           <w:rtl w:val="0"/>
         </w:rPr>
-        <w:t xml:space="preserve">Depending on your jurisdiction (e.g., CCPA/CPRA in California or GDPR/UK GDPR in the EU/UK), you may have specific privacy rights (access, deletion, portability, objection). These are described in detail in our Privacy Policy and can be exercised via support@bettim.com.</w:t>
+        <w:t xml:space="preserve">Depending on your jurisdiction (e.g., CCPA/CPRA in California or GDPR/UK GDPR in the EU/UK), you may have specific privacy rights (access, deletion, portability, objection). These are described in detail in our Privacy Policy and can be exercised via support@bettim.co.</w:t>
       </w:r>
     </w:p>
     <w:p>
@@ -681,9 +708,9 @@
           <w:szCs w:val="24"/>
           <w:rtl w:val="0"/>
         </w:rPr>
-        <w:t xml:space="preserve">By using Bettim, you consent to receive communications electronically (email, in-app, or website). You may withdraw consent by contacting support@bettim.com, though doing so may require account closure. By clicking “I Agree,” you are electronically signing these Terms.</w:t>
+        <w:t xml:space="preserve">By using Bettim, you consent to receive communications electronically (email, in-app, or website). You may withdraw consent by contacting support@bettim.co, though doing so may require account closure. By clicking “I Agree,” you are electronically signing these Terms.</w:t>
         <w:br w:type="textWrapping"/>
-        <w:t xml:space="preserve"> Marketing Opt-Out. You may opt out of non-essential marketing emails at any time via the unsubscribe link or by contacting support@bettim.com. Service, security, or transactional notices are essential and may continue after opt-out.</w:t>
+        <w:t xml:space="preserve"> Marketing Opt-Out. You may opt out of non-essential marketing emails at any time via the unsubscribe link or by contacting support@bettim.co. Service, security, or transactional notices are essential and may continue after opt-out.</w:t>
         <w:br w:type="textWrapping"/>
         <w:t xml:space="preserve"> Any informal communications (including chat messages or community posts) do not constitute legal notices to Bettim.</w:t>
       </w:r>
@@ -734,7 +761,7 @@
           <w:szCs w:val="24"/>
           <w:rtl w:val="0"/>
         </w:rPr>
-        <w:t xml:space="preserve">Bettim strives to make its Services accessible to all users, including those with disabilities. If you encounter accessibility barriers, contact support@bettim.com and we will make reasonable efforts to address them.</w:t>
+        <w:t xml:space="preserve">Bettim strives to make its Services accessible to all users, including those with disabilities. If you encounter accessibility barriers, contact support@bettim.co and we will make reasonable efforts to address them.</w:t>
       </w:r>
     </w:p>
     <w:p>
@@ -1223,6 +1250,68 @@
     </w:p>
     <w:p>
       <w:pPr>
+        <w:shd w:fill="ffffff" w:val="clear"/>
+        <w:spacing w:after="240" w:before="240" w:line="458.1818181818182" w:lineRule="auto"/>
+        <w:rPr>
+          <w:b w:val="1"/>
+          <w:bCs w:val="1"/>
+          <w:color w:val="0f1115"/>
+          <w:sz w:val="24"/>
+          <w:szCs w:val="24"/>
+        </w:rPr>
+      </w:pPr>
+      <w:r>
+        <w:rPr>
+          <w:b w:val="1"/>
+          <w:bCs w:val="1"/>
+          <w:color w:val="0f1115"/>
+          <w:sz w:val="24"/>
+          <w:szCs w:val="24"/>
+          <w:rtl w:val="0"/>
+        </w:rPr>
+        <w:t xml:space="preserve">2.7a No Affiliation / No Endorsement</w:t>
+      </w:r>
+    </w:p>
+    <w:p>
+      <w:pPr>
+        <w:shd w:fill="ffffff" w:val="clear"/>
+        <w:spacing w:after="240" w:before="240" w:line="458.1818181818182" w:lineRule="auto"/>
+        <w:rPr>
+          <w:color w:val="0f1115"/>
+          <w:sz w:val="24"/>
+          <w:szCs w:val="24"/>
+        </w:rPr>
+      </w:pPr>
+      <w:r>
+        <w:rPr>
+          <w:color w:val="0f1115"/>
+          <w:sz w:val="24"/>
+          <w:szCs w:val="24"/>
+          <w:rtl w:val="0"/>
+        </w:rPr>
+        <w:t xml:space="preserve">Bettim is an independent platform and is not affiliated with, endorsed by, sponsored by, or in any way officially connected with the National Basketball Association (NBA), the NCAA, or any of their respective teams, conferences, member institutions, leagues, subsidiaries, or affiliates. Any references within the Services to leagues, teams, players, venues, trademarks, or events are for informational and descriptive purposes only. All third-party names, logos, marks, and related intellectual property are the property of their respective owners, and any use within the Services does not imply any partnership, endorsement, or official status.</w:t>
+        <w:br w:type="textWrapping"/>
+        <w:t xml:space="preserve">For the avoidance of doubt, any mascots, characters, avatars, artwork, or other creative assets displayed in the Services are independently created and are not official league or team assets. Bettim does not claim any rights in third-party trademarks, logos, uniforms, or other brand identifiers, and users may not use the Services in a manner that suggests official affiliation.</w:t>
+      </w:r>
+    </w:p>
+    <w:p>
+      <w:pPr>
+        <w:shd w:fill="ffffff" w:val="clear"/>
+        <w:spacing w:after="240" w:before="240" w:line="458.1818181818182" w:lineRule="auto"/>
+        <w:rPr>
+          <w:color w:val="0f1115"/>
+          <w:sz w:val="24"/>
+          <w:szCs w:val="24"/>
+        </w:rPr>
+      </w:pPr>
+      <w:r>
+        <w:rPr>
+          <w:rtl w:val="0"/>
+        </w:rPr>
+      </w:r>
+    </w:p>
+    <w:p>
+      <w:pPr>
         <w:pStyle w:val="Heading3"/>
         <w:keepNext w:val="0"/>
         <w:keepLines w:val="0"/>
@@ -1611,7 +1700,7 @@
           <w:szCs w:val="24"/>
           <w:rtl w:val="0"/>
         </w:rPr>
-        <w:t xml:space="preserve">If you believe that a child under 13 has created an account, please contact support@bettim.com so we can take appropriate action.</w:t>
+        <w:t xml:space="preserve">If you believe that a child under 13 has created an account, please contact support@bettim.co so we can take appropriate action.</w:t>
       </w:r>
     </w:p>
     <w:p>
@@ -1772,7 +1861,7 @@
         <w:br w:type="textWrapping"/>
         <w:t xml:space="preserve"> f. Reverse engineering, decompiling, or attempting to derive the source code, underlying ideas, or algorithms of the Services, except to the extent such restriction is prohibited by applicable law.</w:t>
         <w:br w:type="textWrapping"/>
-        <w:t xml:space="preserve"> g. Unauthorized testing, scanning, or probing is prohibited. Good-faith vulnerability reports may be submitted to support@bettim.com. Bettim will not pursue legal action for good-faith research that (i) avoids privacy violations, service disruption, and data exfiltration; (ii) is promptly reported; and (iii) is reasonably time-boxed to remediation coordination.</w:t>
+        <w:t xml:space="preserve"> g. Unauthorized testing, scanning, or probing is prohibited. Good-faith vulnerability reports may be submitted to support@bettim.co. Bettim will not pursue legal action for good-faith research that (i) avoids privacy violations, service disruption, and data exfiltration; (ii) is promptly reported; and (iii) is reasonably time-boxed to remediation coordination.</w:t>
       </w:r>
     </w:p>
     <w:p>
@@ -1939,7 +2028,7 @@
           <w:szCs w:val="24"/>
           <w:rtl w:val="0"/>
         </w:rPr>
-        <w:t xml:space="preserve">You are responsible for maintaining the confidentiality of your login credentials and for all activity under your Account. You must promptly notify Bettim at support@bettim.com of any suspected unauthorized access or security breach. Bettim is not liable for losses resulting from unauthorized access caused by your failure to safeguard credentials, except where required by law. Users are encouraged to enable two-factor authentication (2FA) where available to enhance account protection.</w:t>
+        <w:t xml:space="preserve">You are responsible for maintaining the confidentiality of your login credentials and for all activity under your Account. You must promptly notify Bettim at support@bettim.co of any suspected unauthorized access or security breach. Bettim is not liable for losses resulting from unauthorized access caused by your failure to safeguard credentials, except where required by law. Users are encouraged to enable two-factor authentication (2FA) where available to enhance account protection.</w:t>
       </w:r>
     </w:p>
     <w:p>
@@ -2037,7 +2126,12 @@
           <w:szCs w:val="24"/>
           <w:rtl w:val="0"/>
         </w:rPr>
-        <w:t xml:space="preserve">To enforce these Terms and applicable laws, Bettim may perform IP, GPS, device integrity, and network checks, and may block access via VPNs, proxies, or anonymizers. By using the Services, you consent to such checks and related processing as described in the Privacy Policy. These checks are used solely for compliance and fraud prevention purposes and are processed in accordance with Bettim’s Privacy Policy.</w:t>
+        <w:t xml:space="preserve">To enforce these Terms and applicable laws, Bettim may, where available, perform IP-based location signals, device integrity, and network checks, and may restrict access via VPNs, proxies, or anonymizers. Bettim does not guarantee that such checks will be available or effective in all cases. By using the Services, you consent to such checks and related processing as described in the Privacy Policy. These checks are used solely for compliance and fraud prevention purposes and are processed in accordance with Bettim’s Privacy Policy.</w:t>
+      </w:r>
+      <w:r>
+        <w:rPr>
+          <w:rtl w:val="0"/>
+        </w:rPr>
       </w:r>
     </w:p>
     <w:p>
@@ -2112,52 +2206,117 @@
     </w:p>
     <w:p>
       <w:pPr>
-        <w:pStyle w:val="Heading2"/>
-        <w:keepNext w:val="0"/>
-        <w:keepLines w:val="0"/>
+        <w:pStyle w:val="Heading3"/>
         <w:shd w:fill="ffffff" w:val="clear"/>
         <w:spacing w:after="80" w:line="458.1818181818182" w:lineRule="auto"/>
         <w:rPr>
-          <w:b w:val="1"/>
-          <w:bCs w:val="1"/>
-          <w:color w:val="0f1115"/>
+          <w:i w:val="1"/>
+          <w:iCs w:val="1"/>
+          <w:sz w:val="24"/>
+          <w:szCs w:val="24"/>
+        </w:rPr>
+      </w:pPr>
+      <w:bookmarkStart w:colFirst="0" w:colLast="0" w:name="_r6nm2242lt46" w:id="36"/>
+      <w:bookmarkEnd w:id="36"/>
+      <w:r>
+        <w:rPr>
           <w:sz w:val="34"/>
           <w:szCs w:val="34"/>
-        </w:rPr>
-      </w:pPr>
-      <w:bookmarkStart w:colFirst="0" w:colLast="0" w:name="_8pcj5r8jfe8e" w:id="36"/>
-      <w:bookmarkEnd w:id="36"/>
-      <w:r>
-        <w:rPr>
-          <w:b w:val="1"/>
-          <w:bCs w:val="1"/>
-          <w:color w:val="0f1115"/>
+          <w:rtl w:val="0"/>
+        </w:rPr>
+        <w:t xml:space="preserve">4. Digital Purchases and Virtual Items</w:t>
+        <w:br w:type="textWrapping"/>
+      </w:r>
+      <w:r>
+        <w:rPr>
+          <w:b w:val="1"/>
+          <w:bCs w:val="1"/>
+          <w:sz w:val="26"/>
+          <w:szCs w:val="26"/>
+          <w:rtl w:val="0"/>
+        </w:rPr>
+        <w:t xml:space="preserve">4.0</w:t>
+      </w:r>
+      <w:r>
+        <w:rPr>
           <w:sz w:val="34"/>
           <w:szCs w:val="34"/>
           <w:rtl w:val="0"/>
         </w:rPr>
-        <w:t xml:space="preserve">4. Digital Purchases and Virtual Items</w:t>
-      </w:r>
-    </w:p>
-    <w:p>
-      <w:pPr>
-        <w:pStyle w:val="Heading3"/>
-        <w:keepNext w:val="0"/>
-        <w:keepLines w:val="0"/>
-        <w:shd w:fill="ffffff" w:val="clear"/>
-        <w:spacing w:before="280" w:line="458.1818181818182" w:lineRule="auto"/>
-        <w:rPr>
-          <w:b w:val="1"/>
-          <w:bCs w:val="1"/>
-          <w:color w:val="0f1115"/>
-          <w:sz w:val="26"/>
-          <w:szCs w:val="26"/>
-        </w:rPr>
-      </w:pPr>
-      <w:bookmarkStart w:colFirst="0" w:colLast="0" w:name="_6dmom4dvb3bs" w:id="37"/>
+        <w:t xml:space="preserve"> </w:t>
+      </w:r>
+      <w:r>
+        <w:rPr>
+          <w:b w:val="1"/>
+          <w:bCs w:val="1"/>
+          <w:sz w:val="26"/>
+          <w:szCs w:val="26"/>
+          <w:rtl w:val="0"/>
+        </w:rPr>
+        <w:t xml:space="preserve">No Payments Currently / Future Purchases</w:t>
+      </w:r>
+      <w:r>
+        <w:rPr>
+          <w:sz w:val="24"/>
+          <w:szCs w:val="24"/>
+          <w:rtl w:val="0"/>
+        </w:rPr>
+        <w:br w:type="textWrapping"/>
+        <w:t xml:space="preserve"> </w:t>
+      </w:r>
+      <w:r>
+        <w:rPr>
+          <w:i w:val="1"/>
+          <w:iCs w:val="1"/>
+          <w:sz w:val="24"/>
+          <w:szCs w:val="24"/>
+          <w:rtl w:val="0"/>
+        </w:rPr>
+        <w:t xml:space="preserve">The Services do not currently support real-money payments, purchases, subscriptions, or the sale of Coins or other digital items for money (“Paid Features”). If Bettim introduces Paid Features in the future, the terms in this Section 4 will apply to such Paid Features from the effective date communicated to users, and any transactions will be processed by third-party payment processors and/or applicable app store billing systems.</w:t>
+      </w:r>
+    </w:p>
+    <w:p>
+      <w:pPr>
+        <w:pStyle w:val="Heading2"/>
+        <w:keepNext w:val="0"/>
+        <w:keepLines w:val="0"/>
+        <w:shd w:fill="ffffff" w:val="clear"/>
+        <w:spacing w:after="80" w:line="458.1818181818182" w:lineRule="auto"/>
+        <w:rPr>
+          <w:b w:val="1"/>
+          <w:bCs w:val="1"/>
+          <w:color w:val="0f1115"/>
+          <w:sz w:val="34"/>
+          <w:szCs w:val="34"/>
+        </w:rPr>
+      </w:pPr>
+      <w:bookmarkStart w:colFirst="0" w:colLast="0" w:name="_uby4oyri9s2e" w:id="37"/>
       <w:bookmarkEnd w:id="37"/>
       <w:r>
         <w:rPr>
+          <w:rtl w:val="0"/>
+        </w:rPr>
+      </w:r>
+    </w:p>
+    <w:p>
+      <w:pPr>
+        <w:pStyle w:val="Heading3"/>
+        <w:keepNext w:val="0"/>
+        <w:keepLines w:val="0"/>
+        <w:shd w:fill="ffffff" w:val="clear"/>
+        <w:spacing w:before="280" w:line="458.1818181818182" w:lineRule="auto"/>
+        <w:rPr>
+          <w:b w:val="1"/>
+          <w:bCs w:val="1"/>
+          <w:color w:val="0f1115"/>
+          <w:sz w:val="26"/>
+          <w:szCs w:val="26"/>
+        </w:rPr>
+      </w:pPr>
+      <w:bookmarkStart w:colFirst="0" w:colLast="0" w:name="_6dmom4dvb3bs" w:id="38"/>
+      <w:bookmarkEnd w:id="38"/>
+      <w:r>
+        <w:rPr>
           <w:b w:val="1"/>
           <w:bCs w:val="1"/>
           <w:color w:val="0f1115"/>
@@ -2225,26 +2384,26 @@
           <w:szCs w:val="24"/>
           <w:rtl w:val="0"/>
         </w:rPr>
-        <w:t xml:space="preserve">Refund requests may be submitted within 7 days via support@bettim.com or through your app store. Requests will be reviewed on a case-by-case basis and may be denied if terms are violated or fraud is suspected. Refunds, where approved, are processed to the original payment method only. Nothing in this section affects any non-waivable statutory consumer rights under EU or UK law.</w:t>
-      </w:r>
-    </w:p>
-    <w:p>
-      <w:pPr>
-        <w:pStyle w:val="Heading3"/>
-        <w:keepNext w:val="0"/>
-        <w:keepLines w:val="0"/>
-        <w:shd w:fill="ffffff" w:val="clear"/>
-        <w:spacing w:before="280" w:line="458.1818181818182" w:lineRule="auto"/>
-        <w:rPr>
-          <w:b w:val="1"/>
-          <w:bCs w:val="1"/>
-          <w:color w:val="0f1115"/>
-          <w:sz w:val="26"/>
-          <w:szCs w:val="26"/>
-        </w:rPr>
-      </w:pPr>
-      <w:bookmarkStart w:colFirst="0" w:colLast="0" w:name="_un9868j9oezi" w:id="38"/>
-      <w:bookmarkEnd w:id="38"/>
+        <w:t xml:space="preserve">Refund requests may be submitted within 7 days via support@bettim.co or through your app store. Requests will be reviewed on a case-by-case basis and may be denied if terms are violated or fraud is suspected. Refunds, where approved, are processed to the original payment method only. Nothing in this section affects any non-waivable statutory consumer rights under EU or UK law.</w:t>
+      </w:r>
+    </w:p>
+    <w:p>
+      <w:pPr>
+        <w:pStyle w:val="Heading3"/>
+        <w:keepNext w:val="0"/>
+        <w:keepLines w:val="0"/>
+        <w:shd w:fill="ffffff" w:val="clear"/>
+        <w:spacing w:before="280" w:line="458.1818181818182" w:lineRule="auto"/>
+        <w:rPr>
+          <w:b w:val="1"/>
+          <w:bCs w:val="1"/>
+          <w:color w:val="0f1115"/>
+          <w:sz w:val="26"/>
+          <w:szCs w:val="26"/>
+        </w:rPr>
+      </w:pPr>
+      <w:bookmarkStart w:colFirst="0" w:colLast="0" w:name="_un9868j9oezi" w:id="39"/>
+      <w:bookmarkEnd w:id="39"/>
       <w:r>
         <w:rPr>
           <w:b w:val="1"/>
@@ -2279,51 +2438,50 @@
     </w:p>
     <w:p>
       <w:pPr>
-        <w:pStyle w:val="Heading3"/>
-        <w:keepNext w:val="0"/>
-        <w:keepLines w:val="0"/>
-        <w:shd w:fill="ffffff" w:val="clear"/>
-        <w:spacing w:before="280" w:line="458.1818181818182" w:lineRule="auto"/>
-        <w:rPr>
-          <w:b w:val="1"/>
-          <w:bCs w:val="1"/>
-          <w:color w:val="0f1115"/>
-          <w:sz w:val="26"/>
-          <w:szCs w:val="26"/>
-        </w:rPr>
-      </w:pPr>
-      <w:bookmarkStart w:colFirst="0" w:colLast="0" w:name="_25y9nvgui8lz" w:id="39"/>
-      <w:bookmarkEnd w:id="39"/>
-      <w:r>
-        <w:rPr>
-          <w:b w:val="1"/>
-          <w:bCs w:val="1"/>
-          <w:color w:val="0f1115"/>
-          <w:sz w:val="26"/>
-          <w:szCs w:val="26"/>
-          <w:rtl w:val="0"/>
-        </w:rPr>
-        <w:t xml:space="preserve">4.2a Payment Processing and PCI</w:t>
-      </w:r>
-    </w:p>
-    <w:p>
-      <w:pPr>
-        <w:shd w:fill="ffffff" w:val="clear"/>
-        <w:spacing w:after="240" w:before="240" w:line="458.1818181818182" w:lineRule="auto"/>
-        <w:rPr>
-          <w:color w:val="0f1115"/>
-          <w:sz w:val="24"/>
-          <w:szCs w:val="24"/>
-        </w:rPr>
-      </w:pPr>
-      <w:r>
-        <w:rPr>
-          <w:color w:val="0f1115"/>
-          <w:sz w:val="24"/>
-          <w:szCs w:val="24"/>
-          <w:rtl w:val="0"/>
-        </w:rPr>
-        <w:t xml:space="preserve">Payments are processed by licensed third-party payment processors. Bettim does not store full payment card numbers and implements commercially reasonable measures consistent with PCI-DSS requirements applicable to its role.</w:t>
+        <w:shd w:fill="ffffff" w:val="clear"/>
+        <w:spacing w:after="240" w:before="240" w:line="458.1818181818182" w:lineRule="auto"/>
+        <w:rPr>
+          <w:color w:val="0f1115"/>
+          <w:sz w:val="24"/>
+          <w:szCs w:val="24"/>
+        </w:rPr>
+      </w:pPr>
+      <w:r>
+        <w:rPr>
+          <w:b w:val="1"/>
+          <w:bCs w:val="1"/>
+          <w:color w:val="0f1115"/>
+          <w:sz w:val="24"/>
+          <w:szCs w:val="24"/>
+          <w:rtl w:val="0"/>
+        </w:rPr>
+        <w:t xml:space="preserve">4.2a Payment Processing and PCI (If Applicable)</w:t>
+        <w:br w:type="textWrapping"/>
+      </w:r>
+      <w:r>
+        <w:rPr>
+          <w:color w:val="0f1115"/>
+          <w:sz w:val="24"/>
+          <w:szCs w:val="24"/>
+          <w:rtl w:val="0"/>
+        </w:rPr>
+        <w:t xml:space="preserve"> </w:t>
+      </w:r>
+      <w:r>
+        <w:rPr>
+          <w:i w:val="1"/>
+          <w:iCs w:val="1"/>
+          <w:color w:val="0f1115"/>
+          <w:sz w:val="24"/>
+          <w:szCs w:val="24"/>
+          <w:rtl w:val="0"/>
+        </w:rPr>
+        <w:t xml:space="preserve">If Bettim offers Paid Features, payments will be processed by licensed third-party payment processors and/or app store billing providers. Bettim does not store full payment card numbers and will implement commercially reasonable measures consistent with PCI-DSS requirements applicable to its role, if and to the extent such requirements apply.</w:t>
+      </w:r>
+      <w:r>
+        <w:rPr>
+          <w:rtl w:val="0"/>
+        </w:rPr>
       </w:r>
     </w:p>
     <w:p>
@@ -3047,11 +3205,9 @@
         <w:shd w:fill="ffffff" w:val="clear"/>
         <w:spacing w:before="280" w:line="458.1818181818182" w:lineRule="auto"/>
         <w:rPr>
-          <w:b w:val="1"/>
-          <w:bCs w:val="1"/>
-          <w:color w:val="0f1115"/>
-          <w:sz w:val="26"/>
-          <w:szCs w:val="26"/>
+          <w:color w:val="0f1115"/>
+          <w:sz w:val="24"/>
+          <w:szCs w:val="24"/>
         </w:rPr>
       </w:pPr>
       <w:bookmarkStart w:colFirst="0" w:colLast="0" w:name="_asov8xtugkar" w:id="54"/>
@@ -3067,25 +3223,20 @@
         </w:rPr>
         <w:t xml:space="preserve">5.3b Display &amp; Publicity</w:t>
       </w:r>
-    </w:p>
-    <w:p>
-      <w:pPr>
-        <w:shd w:fill="ffffff" w:val="clear"/>
-        <w:spacing w:after="240" w:before="240" w:line="458.1818181818182" w:lineRule="auto"/>
-        <w:rPr>
-          <w:color w:val="0f1115"/>
-          <w:sz w:val="24"/>
-          <w:szCs w:val="24"/>
-        </w:rPr>
-      </w:pPr>
-      <w:r>
-        <w:rPr>
-          <w:color w:val="0f1115"/>
-          <w:sz w:val="24"/>
-          <w:szCs w:val="24"/>
-          <w:rtl w:val="0"/>
-        </w:rPr>
-        <w:t xml:space="preserve">Certain features (e.g., leaderboards, rankings, and chat) are inherently public. By using these features, you agree to the display of your username, avatar, and performance in those contexts. You may choose a pseudonym instead of your legal name. Bettim will not use your personal data for external advertising or commercial endorsements without your separate, explicit consent where required by law.</w:t>
+      <w:r>
+        <w:rPr>
+          <w:color w:val="0f1115"/>
+          <w:sz w:val="24"/>
+          <w:szCs w:val="24"/>
+          <w:rtl w:val="0"/>
+        </w:rPr>
+        <w:br w:type="textWrapping"/>
+        <w:t xml:space="preserve">Certain features (e.g., leaderboards, rankings, and where available chat or community features) are inherently public. By using these features, you agree to the display of your username, avatar, and performance in those contexts. You may choose a pseudonym instead of your legal name. Bettim will not use your personal data for external advertising or commercial endorsements without your separate, explicit consent where required by law.</w:t>
+      </w:r>
+      <w:r>
+        <w:rPr>
+          <w:rtl w:val="0"/>
+        </w:rPr>
       </w:r>
     </w:p>
     <w:p>
@@ -3383,11 +3534,28 @@
           <w:szCs w:val="24"/>
           <w:rtl w:val="0"/>
         </w:rPr>
+        <w:br w:type="textWrapping"/>
         <w:t xml:space="preserve">You agree not to: (a) harass, bully, threaten, or incite violence; (b) post hateful, discriminatory, or obscene content; (c) dox, impersonate others, or misrepresent your identity; (d) spam, advertise, or solicit; (e) share illegal or infringing content.</w:t>
         <w:br w:type="textWrapping"/>
-        <w:t xml:space="preserve"> Public Areas. Chat and leaderboards are public or community-visible; you should have no expectation of privacy in content you post there. Bettim may moderate, remove, or restrict content or access to protect users and platform integrity. Violation of community standards may result in chat suspension, leaderboard removal, or account sanctions. Bettim may report serious threats or unlawful content to competent authorities.</w:t>
+        <w:t xml:space="preserve">Public Areas. Where available, chat, leaderboards, and other community-visible areas are public or community-visible; you should have no expectation of privacy in content you post there. Bettim may moderate, remove, or restrict content or access to protect users and platform integrity. Violation of community standards may result in feature restrictions, leaderboard removal, or account sanctions. Bettim may report serious threats or unlawful content to competent authorities.</w:t>
         <w:br w:type="textWrapping"/>
-        <w:t xml:space="preserve"> California minors may request removal of content they have publicly posted in the Services as required by California law, subject to certain exceptions. Requests can be made via support@bettim.com.</w:t>
+        <w:t xml:space="preserve">California minors may request removal of content they have publicly posted in the Services as required by California law, subject to certain exceptions. Requests can be made via support@bettim.co.</w:t>
+      </w:r>
+    </w:p>
+    <w:p>
+      <w:pPr>
+        <w:shd w:fill="ffffff" w:val="clear"/>
+        <w:spacing w:after="240" w:before="240" w:line="458.1818181818182" w:lineRule="auto"/>
+        <w:rPr>
+          <w:color w:val="0f1115"/>
+          <w:sz w:val="24"/>
+          <w:szCs w:val="24"/>
+        </w:rPr>
+      </w:pPr>
+      <w:r>
+        <w:rPr>
+          <w:rtl w:val="0"/>
+        </w:rPr>
       </w:r>
     </w:p>
     <w:p>
@@ -4364,7 +4532,7 @@
           <w:szCs w:val="24"/>
           <w:rtl w:val="0"/>
         </w:rPr>
-        <w:t xml:space="preserve">You may request closure of your Account at any time by contacting support@bettim.com or via any in-app account deletion flow (where available). Account closure is permanent, revokes all associated licenses to Coins and digital items, and results in forfeiture of any balances or virtual items (which have no cash value). Closure does not override Bettim’s rights or obligations regarding data retention as described in the Privacy Policy. Following an account closure request, Bettim may preserve limited records where reasonably necessary to comply with law, enforce these Terms, or establish, exercise, or defend legal claims.</w:t>
+        <w:t xml:space="preserve">You may request closure of your Account at any time by contacting support@bettim.co or via any in-app account deletion flow (where available). Account closure is permanent, revokes all associated licenses to Coins and digital items, and results in forfeiture of any balances or virtual items (which have no cash value). Closure does not override Bettim’s rights or obligations regarding data retention as described in the Privacy Policy. Following an account closure request, Bettim may preserve limited records where reasonably necessary to comply with law, enforce these Terms, or establish, exercise, or defend legal claims.</w:t>
       </w:r>
     </w:p>
     <w:p>
@@ -4561,7 +4729,7 @@
           <w:szCs w:val="24"/>
           <w:rtl w:val="0"/>
         </w:rPr>
-        <w:t xml:space="preserve">Before initiating arbitration or legal action, both parties agree to attempt to resolve any dispute informally by contacting support@bettim.com. Include a description of the issue and your contact details. Bettim will respond within 30 days. If not resolved within 60 days, either party may proceed to arbitration.</w:t>
+        <w:t xml:space="preserve">Before initiating arbitration or legal action, both parties agree to attempt to resolve any dispute informally by contacting support@bettim.co. Include a description of the issue and your contact details. Bettim will respond within 30 days. If not resolved within 60 days, either party may proceed to arbitration.</w:t>
       </w:r>
     </w:p>
     <w:p>
@@ -4610,7 +4778,7 @@
           <w:szCs w:val="24"/>
           <w:rtl w:val="0"/>
         </w:rPr>
-        <w:t xml:space="preserve">You may opt out of this arbitration agreement within 30 days of first accepting these Terms by emailing support@bettim.com with subject line “Arbitration Opt-Out” and your account email. Opting out will not affect your use of the Services.</w:t>
+        <w:t xml:space="preserve">You may opt out of this arbitration agreement within 30 days of first accepting these Terms by emailing support@bettim.co with subject line “Arbitration Opt-Out” and your account email. Opting out will not affect your use of the Services.</w:t>
       </w:r>
     </w:p>
     <w:p>
@@ -5165,6 +5333,24 @@
           <w:rtl w:val="0"/>
         </w:rPr>
         <w:t xml:space="preserve">All software, source code, graphics, text, logos, audiovisual elements, trademarks, and other content within the Services are owned exclusively by Bettim or its licensors. All trademarks, logos, and service marks displayed within the Services are the property of their respective owners. Nothing herein grants any license or right to use them without express permission. You may not copy, reproduce, distribute, publicly display, or create derivative works without Bettim’s express written consent. All rights not expressly granted are reserved by Bettim.</w:t>
+        <w:br w:type="textWrapping"/>
+        <w:t xml:space="preserve">For clarity, Bettim does not claim ownership of any third-party trademarks or league/team branding that may appear in the Services, and any such use is solely descriptive and does not imply endorsement or affiliation.</w:t>
+      </w:r>
+    </w:p>
+    <w:p>
+      <w:pPr>
+        <w:shd w:fill="ffffff" w:val="clear"/>
+        <w:spacing w:after="240" w:before="240" w:line="458.1818181818182" w:lineRule="auto"/>
+        <w:rPr>
+          <w:color w:val="0f1115"/>
+          <w:sz w:val="24"/>
+          <w:szCs w:val="24"/>
+        </w:rPr>
+      </w:pPr>
+      <w:r>
+        <w:rPr>
+          <w:rtl w:val="0"/>
+        </w:rPr>
       </w:r>
     </w:p>
     <w:p>
@@ -5851,7 +6037,7 @@
         <w:rPr>
           <w:rtl w:val="0"/>
         </w:rPr>
-        <w:t xml:space="preserve">Support (General, Legal &amp; Privacy): support@bettim.com</w:t>
+        <w:t xml:space="preserve">Support (General, Legal &amp; Privacy): support@bettim.co</w:t>
         <w:br w:type="textWrapping"/>
         <w:t xml:space="preserve"> DMCA (Copyright Notices Only): dmca@bettim.co</w:t>
         <w:br w:type="textWrapping"/>
@@ -5895,7 +6081,7 @@
         <w:rPr>
           <w:rtl w:val="0"/>
         </w:rPr>
-        <w:t xml:space="preserve">Bettim designates support@bettim.com as its single point of contact for all user, legal, and privacy correspondence, and dmca@bettim.co for copyright-related matters only. Bettim will internally route communications to the appropriate department. Using any superseded addresses listed in prior versions of these Terms shall not invalidate a notice if received by Bettim.</w:t>
+        <w:t xml:space="preserve">Bettim designates support@bettim.co as its single point of contact for all user, legal, and privacy correspondence, and dmca@bettim.co for copyright-related matters only. Bettim will internally route communications to the appropriate department. Using any superseded addresses listed in prior versions of these Terms shall not invalidate a notice if received by Bettim.</w:t>
       </w:r>
     </w:p>
     <w:p>
@@ -5975,7 +6161,7 @@
         <w:rPr>
           <w:rtl w:val="0"/>
         </w:rPr>
-        <w:t xml:space="preserve">Legal notices to Bettim must be sent to support@bettim.com (or dmca@bettim.co for copyright-related matters), with a copy to the mailing address above. Bettim may provide notices to you via email to the address associated with your Account, via in-app notifications, or by posting within the Services. Notices are deemed given when sent (email) or posted (in-app/website). A notice sent to any successor or superseded Bettim contact address that is actually received by Bettim shall be deemed effective on receipt. For faster routing, include “Legal Notice” in the email subject line. Bettim may accept service of legal process via the email addresses listed above; acceptance by email does not waive any defense related to jurisdiction, venue, or service.</w:t>
+        <w:t xml:space="preserve">Legal notices to Bettim must be sent to support@bettim.co (or dmca@bettim.co for copyright-related matters), with a copy to the mailing address above. Bettim may provide notices to you via email to the address associated with your Account, via in-app notifications, or by posting within the Services. Notices are deemed given when sent (email) or posted (in-app/website). A notice sent to any successor or superseded Bettim contact address that is actually received by Bettim shall be deemed effective on receipt. For faster routing, include “Legal Notice” in the email subject line. Bettim may accept service of legal process via the email addresses listed above; acceptance by email does not waive any defense related to jurisdiction, venue, or service.</w:t>
       </w:r>
     </w:p>
     <w:p>
@@ -6136,7 +6322,7 @@
         <w:rPr>
           <w:rtl w:val="0"/>
         </w:rPr>
-        <w:t xml:space="preserve">You may withdraw consent by contacting support@bettim.com. Withdrawal may limit your ability to use the Services and may result in account closure.</w:t>
+        <w:t xml:space="preserve">You may withdraw consent by contacting support@bettim.co. Withdrawal may limit your ability to use the Services and may result in account closure.</w:t>
       </w:r>
     </w:p>
     <w:p>
@@ -6176,7 +6362,7 @@
         <w:rPr>
           <w:rtl w:val="0"/>
         </w:rPr>
-        <w:t xml:space="preserve">You may request paper copies of electronic communications within 30 days by contacting support@bettim.com. Bettim reserves the right to charge a reasonable administrative fee.</w:t>
+        <w:t xml:space="preserve">You may request paper copies of electronic communications within 30 days by contacting support@bettim.co. Bettim reserves the right to charge a reasonable administrative fee.</w:t>
       </w:r>
     </w:p>
     <w:p>

</xml_diff>